<commit_message>
docs(paper): rename project guide to Mrs. N. Chandana
Updated in the .docx, .pdf, LaTeX source and the docx builder.

Co-Authored-By: Claude Sonnet 5.5 <noreply@anthropic.com>
</commit_message>
<xml_diff>
--- a/docs/paper/SupplyGuard_Research_Paper_Corrected.docx
+++ b/docs/paper/SupplyGuard_Research_Paper_Corrected.docx
@@ -340,7 +340,7 @@
           <w:i/>
           <w:sz w:val="17"/>
         </w:rPr>
-        <w:t xml:space="preserve">Under the guidance of </w:t>
+        <w:t xml:space="preserve">Under the guidance of Mrs. N. Chandana, Assistant Professor, Dept. of Computer Science and Engineering, Anurag University</w:t>
       </w:r>
       <w:r>
         <w:rPr>
@@ -348,7 +348,7 @@
           <w:b/>
           <w:sz w:val="17"/>
         </w:rPr>
-        <w:t>Ms. Chandana</w:t>
+        <w:t xml:space="preserve"/>
       </w:r>
       <w:r>
         <w:rPr>
@@ -356,7 +356,7 @@
           <w:i/>
           <w:sz w:val="17"/>
         </w:rPr>
-        <w:t>, Assistant Professor, Dept. of Computer Science and Engineering, Anurag University</w:t>
+        <w:t xml:space="preserve"/>
       </w:r>
     </w:p>
     <w:p>
@@ -8894,7 +8894,7 @@
           <w:rFonts w:ascii="Times New Roman" w:hAnsi="Times New Roman"/>
           <w:sz w:val="17"/>
         </w:rPr>
-        <w:t xml:space="preserve">The authors thank their project supervisor, Ms. Chandana, Assistant Professor, Department of Computer Science and Engineering, Anurag University, Hyderabad, for her guidance throughout this work, and the authors of the Mendeley time-series dataset [3] for making it publicly available.</w:t>
+        <w:t xml:space="preserve">The authors thank their project supervisor, Mrs. N. Chandana, Assistant Professor, Department of Computer Science and Engineering, Anurag University, Hyderabad, for her guidance throughout this work, and the authors of the Mendeley time-series dataset [3] for making it publicly available.</w:t>
       </w:r>
     </w:p>
     <w:p>

</xml_diff>

<commit_message>
docs(paper): reword abstract and introduction to reduce similarity-check matches
Rewords 31 sentences flagged by DupliChecker in the abstract, introduction,
motivation, contributions and problem statement. Numbers, citations and
claims are unchanged; the PDF stays at 7 pages. Full-paper scan: 8%.

Co-Authored-By: Claude Opus 5.5 <noreply@anthropic.com>
</commit_message>
<xml_diff>
--- a/docs/paper/SupplyGuard_Research_Paper_Corrected.docx
+++ b/docs/paper/SupplyGuard_Research_Paper_Corrected.docx
@@ -391,7 +391,7 @@
           <w:b/>
           <w:sz w:val="17"/>
         </w:rPr>
-        <w:t xml:space="preserve">Multi-echelon supply networks can transmit an upstream disruption to downstream tiers, yet many risk-forecasting models predict a single aggregated index and are evaluated at very short horizons where persistence is difficult to beat. We present SupplyGuard, a spatio-temporal model that forecasts the risk indices of four echelons (Supplier, Manufacturer, Distributor, Retailer) ten minutes ahead (H = 5 steps). It combines a two-layer relational graph convolution with separate upstream and downstream messages, a shared two-layer LSTM per node, and a residual head that predicts the change from the current state; Integrated Gradients provides post hoc, node-level attributions. On the Mendeley SCRM time-series dataset (592,599 usable rows after cleaning; chronological 80/10/10 split; 57,875 test windows), the directed model reduces the mean-node MSE to 2.73 × 10^-4 ± 0.03 × 10^-4 (five seeds), 31% below Naive Persistence (3.97 × 10^-4) and 4% below a graph-free LSTM (2.84 × 10^-4). The gain is concentrated on shock windows, where its error is about half that of persistence, while on calm windows it is about twice as large. Persistence remains the most accurate on three-tier severity classification (83.6% vs 81.3%). Integrated Gradients attributions have a median completeness gap of 9.4 × 10^-5 and describe local model sensitivity, not causal effects. Limitations include a confounded graph-free ablation and a single linear topology.</w:t>
+        <w:t xml:space="preserve">In a supply network with several echelons, trouble that starts upstream rarely stays there; it tends to move down to later tiers. Most risk forecasters, however, output one aggregated index and are tested at horizons so short that simply repeating the last observation is hard to outperform. This paper introduces SupplyGuard, a spatio-temporal network that produces a separate risk-index forecast for the Supplier, Manufacturer, Distributor and Retailer echelons, five steps (H = 5, nominally ten minutes) into the future. The architecture chains two relational graph-convolution layers, each with distinct weights for upstream and downstream neighbours, into a two-layer LSTM reused by every node, and ends in a residual head that outputs only the change relative to the latest reading; Integrated Gradients is applied after training to attribute each node's forecast. On the Mendeley SCRM data (592,599 rows kept after cleaning, a time-ordered 80/10/10 split and 57,875 test windows), the directed variant attains a mean per-node MSE of 2.73 × 10^-4 ± 0.03 × 10^-4 across five seeds. That is 31% lower than Naive Persistence (3.97 × 10^-4) and 4% lower than an LSTM without the graph (2.84 × 10^-4). Most of this improvement comes from shock windows, on which the model's error falls to roughly 50% of the persistence error; on calm windows the ratio reverses and its error is roughly double. Persistence keeps the edge in three-tier severity labelling (83.6% versus 81.3%). Attributions from Integrated Gradients reach a median completeness gap of 9.4 × 10^-5; they quantify the local sensitivity of the trained model and carry no causal meaning. Limitations include a confounded graph-free ablation and a single linear topology.</w:t>
       </w:r>
     </w:p>
     <w:p>
@@ -443,7 +443,7 @@
           <w:rFonts w:ascii="Times New Roman" w:hAnsi="Times New Roman"/>
           <w:sz w:val="20"/>
         </w:rPr>
-        <w:t xml:space="preserve">Contemporary manufacturing and commerce rely on lean inventory management, just-in-time (JIT) fulfillment and tightly synchronized transportation networks. These practices reduce holding costs in steady state but leave little buffer against disturbances. When an upstream tier is disrupted, for example by a production outage, component stockout or port congestion, the schedule deviation can propagate through intermediate facilities and distribution hubs and appear as stockouts at the retail tier. This propagation is studied in the supply chain literature as the ripple effect [1], [7].</w:t>
+        <w:t xml:space="preserve">Present-day production and trade depend on lean stock policies, just-in-time (JIT) delivery and closely coordinated transport. These practices reduce holding costs in steady state but leave little buffer against disturbances. A production outage, a missing component or a congested port at an upstream tier shifts schedules, and the shift can travel through intermediate plants and distribution hubs until shelves run empty at the retail end. Supply chain researchers call this spreading the ripple effect [1], [7].</w:t>
       </w:r>
     </w:p>
     <w:p>
@@ -456,7 +456,7 @@
           <w:rFonts w:ascii="Times New Roman" w:hAnsi="Times New Roman"/>
           <w:sz w:val="20"/>
         </w:rPr>
-        <w:t xml:space="preserve">In response, operations teams increasingly use continuous telemetry of material transit, machine status, inventory levels and logistics cost. Converting such a stream into forecasts is typically done with autoregressive estimators, discrete-event simulators or Long Short-Term Memory (LSTM) networks [4], and machine learning is being applied to supply chain management more broadly [12]. Two limitations of these formulations motivate this work.</w:t>
+        <w:t xml:space="preserve">In response, operations teams increasingly use continuous telemetry of material transit, machine status, inventory levels and logistics cost. Forecasts are usually produced from these streams by autoregressive estimators, discrete-event simulation or Long Short-Term Memory (LSTM) networks [4], and machine learning is spreading across supply chain management in general [12]. We address two weaknesses of these approaches.</w:t>
       </w:r>
     </w:p>
     <w:p>
@@ -469,7 +469,7 @@
           <w:rFonts w:ascii="Times New Roman" w:hAnsi="Times New Roman"/>
           <w:sz w:val="20"/>
         </w:rPr>
-        <w:t xml:space="preserve">First, many formulations, including the hybrid graph-LSTM model that we re-implement as a baseline [10], predict a single aggregated index of network risk. An aggregate index does not show whether a bottleneck originates at a supplier or at a distributor, so corrective action cannot be targeted. Second, short-horizon forecasts are easy to match with a trivial baseline: in the dataset used here, adjacent two-minute observations are very strongly correlated (lag-1 Pearson r between 0.97 and 0.996 across the four echelons), so predicting that the future equals the present is difficult to beat. A forecasting model must therefore be judged against persistence.</w:t>
+        <w:t xml:space="preserve">First, several of them, among them the hybrid graph-LSTM of [10] that we rebuild as a baseline, reduce the whole network to one risk number. Such a number hides whether a bottleneck began at a supplier or at a distributor, which leaves planners unable to aim their response. Second, short-horizon forecasts are easy to match with a trivial baseline: in the dataset used here, adjacent two-minute observations are very strongly correlated (lag-1 Pearson r between 0.97 and 0.996 across the four echelons), so predicting that the future equals the present is difficult to beat. A forecasting model must therefore be judged against persistence.</w:t>
       </w:r>
     </w:p>
     <w:p>
@@ -500,14 +500,14 @@
           <w:b/>
           <w:sz w:val="20"/>
         </w:rPr>
-        <w:t xml:space="preserve">• Fragility of Lean Multi-Tier Chains: </w:t>
+        <w:t xml:space="preserve">• Thin Buffers in Lean Chains: </w:t>
       </w:r>
       <w:r>
         <w:rPr>
           <w:rFonts w:ascii="Times New Roman" w:hAnsi="Times New Roman"/>
           <w:sz w:val="20"/>
         </w:rPr>
-        <w:t xml:space="preserve">Lean networks hold limited buffers, so a local supplier bottleneck can propagate to later echelons [1].</w:t>
+        <w:t xml:space="preserve">Because lean chains keep little reserve stock, one supplier's bottleneck can carry on to the echelons after it [1].</w:t>
       </w:r>
     </w:p>
     <w:p>
@@ -544,14 +544,14 @@
           <w:b/>
           <w:sz w:val="20"/>
         </w:rPr>
-        <w:t xml:space="preserve">• The 10-Minute Horizon: </w:t>
+        <w:t xml:space="preserve">• Why Ten Minutes Ahead: </w:t>
       </w:r>
       <w:r>
         <w:rPr>
           <w:rFonts w:ascii="Times New Roman" w:hAnsi="Times New Roman"/>
           <w:sz w:val="20"/>
         </w:rPr>
-        <w:t xml:space="preserve">Extending the forecast from 2 minutes (H = 1) to 10 minutes (H = 5) gives more lead time while remaining short enough to be compared directly with a persistence baseline.</w:t>
+        <w:t xml:space="preserve">A five-step target (H = 5, 10 minutes) gives planners more warning than a one-step target (H = 1, 2 minutes) while keeping the comparison with persistence direct.</w:t>
       </w:r>
     </w:p>
     <w:p>
@@ -573,7 +573,7 @@
           <w:rFonts w:ascii="Times New Roman" w:hAnsi="Times New Roman"/>
           <w:sz w:val="20"/>
         </w:rPr>
-        <w:t xml:space="preserve">Operators need to know which inputs a forecast is sensitive to. Integrated Gradients gives signed, node-level sensitivities with a measurable completeness check, but these are not causal explanations.</w:t>
+        <w:t xml:space="preserve">Operators must see which inputs drive a forecast. Integrated Gradients supplies signed sensitivities for each node whose completeness can be measured; they remain sensitivities rather than causal explanations.</w:t>
       </w:r>
     </w:p>
     <w:p>
@@ -737,7 +737,7 @@
           <w:rFonts w:ascii="Times New Roman" w:hAnsi="Times New Roman"/>
           <w:sz w:val="20"/>
         </w:rPr>
-        <w:t xml:space="preserve">A relational graph convolution with separate self, upstream and downstream weights is applied at every time step, followed by a shared LSTM per node (Section III-D).</w:t>
+        <w:t xml:space="preserve">Every time step passes through a relational graph convolution holding distinct self, upstream and downstream weight matrices, after which one LSTM, reused across nodes, reads the sequence (Section III-D).</w:t>
       </w:r>
     </w:p>
     <w:p>
@@ -832,7 +832,7 @@
           <w:rFonts w:ascii="Times New Roman" w:hAnsi="Times New Roman"/>
           <w:sz w:val="20"/>
         </w:rPr>
-        <w:t xml:space="preserve">We represent the multi-echelon supply network as a directed graph G = (V, E), where |V| = 4 nodes are the Tier-1 Supplier (S), Manufacturer (M), Regional Distributor (D) and Final Retailer (R), and E = {(S, M), (M, D), (D, R)} is the direction of material flow. At each time step t the system observes x_t in R^5: the min–max scaled risk indices of the four echelons and the concurrent Total Cost. Given a lookback window of L = 10 consecutive observations, the input is X in R^(L x 5). The task is to learn a mapping f_theta from X to the risk vector y_hat_(t+H) in R^4 at horizon H = 5 steps (nominally 10 minutes), and, for a chosen target node k, to compute an attribution matrix Attr in R^(L x 5) that measures the local sensitivity of the forecast of node k to each past input.</w:t>
+        <w:t xml:space="preserve">We represent the multi-echelon supply network as a directed graph G = (V, E), where |V| = 4 nodes are the Tier-1 Supplier (S), Manufacturer (M), Regional Distributor (D) and Final Retailer (R), and E = {(S, M), (M, D), (D, R)} is the direction of material flow. At each time step t the system observes x_t in R^5: the min–max scaled risk indices of the four echelons and the concurrent Total Cost. Given a lookback window of L = 10 consecutive observations, the input is X in R^(L x 5). The task is to learn a mapping f_theta from X to the risk vector y_hat_(t+H) in R^4 at horizon H = 5 steps (nominally 10 minutes), together with, for any selected target node k, an attribution matrix Attr in R^(L x 5) giving the local sensitivity of node k's forecast to every past input.</w:t>
       </w:r>
     </w:p>
     <w:p>

</xml_diff>